<commit_message>
Atualização completa do projeto com todos os laboratórios 01-16
</commit_message>
<xml_diff>
--- a/labs/lab02/lab02.docx
+++ b/labs/lab02/lab02.docx
@@ -31,7 +31,7 @@
         <w:t xml:space="preserve"> </w:t>
       </w:r>
       <w:r>
-        <w:t xml:space="preserve">№2</w:t>
+        <w:t xml:space="preserve">№5</w:t>
       </w:r>
       <w:r>
         <w:t xml:space="preserve"> </w:t>
@@ -57,13 +57,19 @@
         <w:pStyle w:val="Subtitle"/>
       </w:pPr>
       <w:r>
-        <w:t xml:space="preserve">Администрациа</w:t>
-      </w:r>
-      <w:r>
-        <w:t xml:space="preserve"> </w:t>
-      </w:r>
-      <w:r>
-        <w:t xml:space="preserve">Система</w:t>
+        <w:t xml:space="preserve">Управление</w:t>
+      </w:r>
+      <w:r>
+        <w:t xml:space="preserve"> </w:t>
+      </w:r>
+      <w:r>
+        <w:t xml:space="preserve">процессами</w:t>
+      </w:r>
+      <w:r>
+        <w:t xml:space="preserve"> </w:t>
+      </w:r>
+      <w:r>
+        <w:t xml:space="preserve">в</w:t>
       </w:r>
       <w:r>
         <w:t xml:space="preserve"> </w:t>
@@ -154,7 +160,7 @@
         </w:numPr>
       </w:pPr>
       <w:r>
-        <w:t xml:space="preserve">Развить навыки администрирования ОС Linux.</w:t>
+        <w:t xml:space="preserve">Изучить основы управления процессами в ОС Linux.</w:t>
       </w:r>
     </w:p>
     <w:p>
@@ -166,7 +172,7 @@
         </w:numPr>
       </w:pPr>
       <w:r>
-        <w:t xml:space="preserve">Получить первое практическое знакомство с технологией SELinux.</w:t>
+        <w:t xml:space="preserve">Освоить команды для мониторинга и контроля процессов.</w:t>
       </w:r>
     </w:p>
     <w:p>
@@ -178,7 +184,19 @@
         </w:numPr>
       </w:pPr>
       <w:r>
-        <w:t xml:space="preserve">Проверить работу SELinux на практике совместно с веб-сервером Apache.</w:t>
+        <w:t xml:space="preserve">Научиться управлять приоритетами и сигналами процессов.</w:t>
+      </w:r>
+    </w:p>
+    <w:p>
+      <w:pPr>
+        <w:pStyle w:val="Compact"/>
+        <w:numPr>
+          <w:ilvl w:val="0"/>
+          <w:numId w:val="1001"/>
+        </w:numPr>
+      </w:pPr>
+      <w:r>
+        <w:t xml:space="preserve">Изучить механизмы фонового и интерактивного выполнения задач.</w:t>
       </w:r>
     </w:p>
     <w:bookmarkEnd w:id="20"/>
@@ -193,743 +211,866 @@
     </w:p>
     <w:p>
       <w:pPr>
-        <w:pStyle w:val="Compact"/>
+        <w:pStyle w:val="FirstParagraph"/>
+      </w:pPr>
+      <w:r>
+        <w:rPr>
+          <w:b/>
+          <w:bCs/>
+        </w:rPr>
+        <w:t xml:space="preserve">Управление процессами</w:t>
+      </w:r>
+      <w:r>
+        <w:t xml:space="preserve"> </w:t>
+      </w:r>
+      <w:r>
+        <w:t xml:space="preserve">— одна из ключевых задач администратора Linux. Процесс представляет собой выполняющуюся программу с выделенными ресурсами. Каждый процесс имеет уникальный идентификатор (PID), приоритет (nice value) и состояние.</w:t>
+      </w:r>
+    </w:p>
+    <w:p>
+      <w:pPr>
+        <w:pStyle w:val="BodyText"/>
+      </w:pPr>
+      <w:r>
+        <w:t xml:space="preserve">Основные команды для работы с процессами:</w:t>
+      </w:r>
+      <w:r>
+        <w:t xml:space="preserve"> </w:t>
+      </w:r>
+      <w:r>
+        <w:t xml:space="preserve">-</w:t>
+      </w:r>
+      <w:r>
+        <w:t xml:space="preserve"> </w:t>
+      </w:r>
+      <w:r>
+        <w:rPr>
+          <w:rStyle w:val="VerbatimChar"/>
+        </w:rPr>
+        <w:t xml:space="preserve">ps</w:t>
+      </w:r>
+      <w:r>
+        <w:t xml:space="preserve"> </w:t>
+      </w:r>
+      <w:r>
+        <w:t xml:space="preserve">— просмотр информации о процессах</w:t>
+      </w:r>
+      <w:r>
+        <w:t xml:space="preserve"> </w:t>
+      </w:r>
+      <w:r>
+        <w:t xml:space="preserve">-</w:t>
+      </w:r>
+      <w:r>
+        <w:t xml:space="preserve"> </w:t>
+      </w:r>
+      <w:r>
+        <w:rPr>
+          <w:rStyle w:val="VerbatimChar"/>
+        </w:rPr>
+        <w:t xml:space="preserve">top</w:t>
+      </w:r>
+      <w:r>
+        <w:t xml:space="preserve"> </w:t>
+      </w:r>
+      <w:r>
+        <w:t xml:space="preserve">/</w:t>
+      </w:r>
+      <w:r>
+        <w:t xml:space="preserve"> </w:t>
+      </w:r>
+      <w:r>
+        <w:rPr>
+          <w:rStyle w:val="VerbatimChar"/>
+        </w:rPr>
+        <w:t xml:space="preserve">htop</w:t>
+      </w:r>
+      <w:r>
+        <w:t xml:space="preserve"> </w:t>
+      </w:r>
+      <w:r>
+        <w:t xml:space="preserve">— интерактивный мониторинг</w:t>
+      </w:r>
+      <w:r>
+        <w:t xml:space="preserve"> </w:t>
+      </w:r>
+      <w:r>
+        <w:t xml:space="preserve">-</w:t>
+      </w:r>
+      <w:r>
+        <w:t xml:space="preserve"> </w:t>
+      </w:r>
+      <w:r>
+        <w:rPr>
+          <w:rStyle w:val="VerbatimChar"/>
+        </w:rPr>
+        <w:t xml:space="preserve">kill</w:t>
+      </w:r>
+      <w:r>
+        <w:t xml:space="preserve"> </w:t>
+      </w:r>
+      <w:r>
+        <w:t xml:space="preserve">— отправка сигналов процессам</w:t>
+      </w:r>
+      <w:r>
+        <w:t xml:space="preserve"> </w:t>
+      </w:r>
+      <w:r>
+        <w:t xml:space="preserve">-</w:t>
+      </w:r>
+      <w:r>
+        <w:t xml:space="preserve"> </w:t>
+      </w:r>
+      <w:r>
+        <w:rPr>
+          <w:rStyle w:val="VerbatimChar"/>
+        </w:rPr>
+        <w:t xml:space="preserve">nice</w:t>
+      </w:r>
+      <w:r>
+        <w:t xml:space="preserve"> </w:t>
+      </w:r>
+      <w:r>
+        <w:t xml:space="preserve">/</w:t>
+      </w:r>
+      <w:r>
+        <w:t xml:space="preserve"> </w:t>
+      </w:r>
+      <w:r>
+        <w:rPr>
+          <w:rStyle w:val="VerbatimChar"/>
+        </w:rPr>
+        <w:t xml:space="preserve">renice</w:t>
+      </w:r>
+      <w:r>
+        <w:t xml:space="preserve"> </w:t>
+      </w:r>
+      <w:r>
+        <w:t xml:space="preserve">— управление приоритетами</w:t>
+      </w:r>
+      <w:r>
+        <w:t xml:space="preserve"> </w:t>
+      </w:r>
+      <w:r>
+        <w:t xml:space="preserve">-</w:t>
+      </w:r>
+      <w:r>
+        <w:t xml:space="preserve"> </w:t>
+      </w:r>
+      <w:r>
+        <w:rPr>
+          <w:rStyle w:val="VerbatimChar"/>
+        </w:rPr>
+        <w:t xml:space="preserve">jobs</w:t>
+      </w:r>
+      <w:r>
+        <w:t xml:space="preserve">,</w:t>
+      </w:r>
+      <w:r>
+        <w:t xml:space="preserve"> </w:t>
+      </w:r>
+      <w:r>
+        <w:rPr>
+          <w:rStyle w:val="VerbatimChar"/>
+        </w:rPr>
+        <w:t xml:space="preserve">fg</w:t>
+      </w:r>
+      <w:r>
+        <w:t xml:space="preserve">,</w:t>
+      </w:r>
+      <w:r>
+        <w:t xml:space="preserve"> </w:t>
+      </w:r>
+      <w:r>
+        <w:rPr>
+          <w:rStyle w:val="VerbatimChar"/>
+        </w:rPr>
+        <w:t xml:space="preserve">bg</w:t>
+      </w:r>
+      <w:r>
+        <w:t xml:space="preserve"> </w:t>
+      </w:r>
+      <w:r>
+        <w:t xml:space="preserve">— управление фоновыми задачами</w:t>
+      </w:r>
+      <w:r>
+        <w:t xml:space="preserve"> </w:t>
+      </w:r>
+      <w:r>
+        <w:t xml:space="preserve">-</w:t>
+      </w:r>
+      <w:r>
+        <w:t xml:space="preserve"> </w:t>
+      </w:r>
+      <w:r>
+        <w:rPr>
+          <w:rStyle w:val="VerbatimChar"/>
+        </w:rPr>
+        <w:t xml:space="preserve">dd</w:t>
+      </w:r>
+      <w:r>
+        <w:t xml:space="preserve">,</w:t>
+      </w:r>
+      <w:r>
+        <w:t xml:space="preserve"> </w:t>
+      </w:r>
+      <w:r>
+        <w:rPr>
+          <w:rStyle w:val="VerbatimChar"/>
+        </w:rPr>
+        <w:t xml:space="preserve">sleep</w:t>
+      </w:r>
+      <w:r>
+        <w:t xml:space="preserve"> </w:t>
+      </w:r>
+      <w:r>
+        <w:t xml:space="preserve">— создание тестовых нагрузок</w:t>
+      </w:r>
+    </w:p>
+    <w:bookmarkEnd w:id="21"/>
+    <w:bookmarkStart w:id="45" w:name="выполнение-лабораторной-работы"/>
+    <w:p>
+      <w:pPr>
+        <w:pStyle w:val="Heading1"/>
+      </w:pPr>
+      <w:r>
+        <w:t xml:space="preserve">Выполнение лабораторной работы</w:t>
+      </w:r>
+    </w:p>
+    <w:bookmarkStart w:id="40" w:name="часть-1-просмотр-и-мониторинг-процессов"/>
+    <w:p>
+      <w:pPr>
+        <w:pStyle w:val="Heading2"/>
+      </w:pPr>
+      <w:r>
+        <w:t xml:space="preserve">Часть 1: Просмотр и мониторинг процессов</w:t>
+      </w:r>
+    </w:p>
+    <w:p>
+      <w:pPr>
         <w:numPr>
           <w:ilvl w:val="0"/>
           <w:numId w:val="1002"/>
         </w:numPr>
       </w:pPr>
       <w:r>
+        <w:t xml:space="preserve">Просмотр всех запущенных процессов с помощью</w:t>
+      </w:r>
+      <w:r>
+        <w:t xml:space="preserve"> </w:t>
+      </w:r>
+      <w:r>
         <w:rPr>
-          <w:b/>
-          <w:bCs/>
+          <w:rStyle w:val="VerbatimChar"/>
         </w:rPr>
-        <w:t xml:space="preserve">SELinux (Security-Enhanced Linux)</w:t>
-      </w:r>
-      <w:r>
-        <w:t xml:space="preserve"> </w:t>
-      </w:r>
-      <w:r>
-        <w:t xml:space="preserve">обеспечивает усиление защиты путем внесения изменений как на уровне ядра,</w:t>
-      </w:r>
-      <w:r>
-        <w:t xml:space="preserve"> </w:t>
-      </w:r>
-      <w:r>
-        <w:t xml:space="preserve">так и на уровне пространства пользователя, что превращает ее в действительно непробиваемую операционную систему.</w:t>
-      </w:r>
-      <w:r>
-        <w:t xml:space="preserve"> </w:t>
-      </w:r>
-      <w:r>
-        <w:t xml:space="preserve">Впервые эта система появилась в четвертой версии CentOS, а в 5 и 6 версии реализация была существенно дополнена и улучшена.</w:t>
-      </w:r>
-    </w:p>
-    <w:p>
-      <w:pPr>
-        <w:pStyle w:val="FirstParagraph"/>
-      </w:pPr>
+        <w:t xml:space="preserve">ps aux</w:t>
+      </w:r>
+    </w:p>
+    <w:p>
+      <w:pPr>
+        <w:pStyle w:val="CaptionedFigure"/>
+        <w:numPr>
+          <w:ilvl w:val="0"/>
+          <w:numId w:val="1000"/>
+        </w:numPr>
+      </w:pPr>
+      <w:r>
+        <w:drawing>
+          <wp:inline>
+            <wp:extent cx="5334000" cy="1812862"/>
+            <wp:effectExtent b="0" l="0" r="0" t="0"/>
+            <wp:docPr descr="Вывод команды ps aux - список всех процессов" title="" id="23" name="Picture"/>
+            <a:graphic>
+              <a:graphicData uri="http://schemas.openxmlformats.org/drawingml/2006/picture">
+                <pic:pic>
+                  <pic:nvPicPr>
+                    <pic:cNvPr descr="image/1.png" id="24" name="Picture"/>
+                    <pic:cNvPicPr>
+                      <a:picLocks noChangeArrowheads="1" noChangeAspect="1"/>
+                    </pic:cNvPicPr>
+                  </pic:nvPicPr>
+                  <pic:blipFill>
+                    <a:blip r:embed="rId22"/>
+                    <a:stretch>
+                      <a:fillRect/>
+                    </a:stretch>
+                  </pic:blipFill>
+                  <pic:spPr bwMode="auto">
+                    <a:xfrm>
+                      <a:off x="0" y="0"/>
+                      <a:ext cx="5334000" cy="1812862"/>
+                    </a:xfrm>
+                    <a:prstGeom prst="rect">
+                      <a:avLst/>
+                    </a:prstGeom>
+                    <a:noFill/>
+                    <a:ln w="9525">
+                      <a:noFill/>
+                      <a:headEnd/>
+                      <a:tailEnd/>
+                    </a:ln>
+                  </pic:spPr>
+                </pic:pic>
+              </a:graphicData>
+            </a:graphic>
+          </wp:inline>
+        </w:drawing>
+      </w:r>
+    </w:p>
+    <w:p>
+      <w:pPr>
+        <w:pStyle w:val="ImageCaption"/>
+        <w:numPr>
+          <w:ilvl w:val="0"/>
+          <w:numId w:val="1000"/>
+        </w:numPr>
+      </w:pPr>
+      <w:r>
+        <w:t xml:space="preserve">Вывод команды ps aux - список всех процессов</w:t>
+      </w:r>
+    </w:p>
+    <w:p>
+      <w:pPr>
+        <w:numPr>
+          <w:ilvl w:val="0"/>
+          <w:numId w:val="1002"/>
+        </w:numPr>
+      </w:pPr>
+      <w:r>
+        <w:t xml:space="preserve">Использование</w:t>
+      </w:r>
+      <w:r>
+        <w:t xml:space="preserve"> </w:t>
+      </w:r>
       <w:r>
         <w:rPr>
-          <w:i/>
-          <w:iCs/>
+          <w:rStyle w:val="VerbatimChar"/>
         </w:rPr>
-        <w:t xml:space="preserve">SELinux имеет три основных режима работы:</w:t>
-      </w:r>
-    </w:p>
-    <w:p>
-      <w:pPr>
-        <w:pStyle w:val="Compact"/>
+        <w:t xml:space="preserve">ps -ef</w:t>
+      </w:r>
+      <w:r>
+        <w:t xml:space="preserve"> </w:t>
+      </w:r>
+      <w:r>
+        <w:t xml:space="preserve">для просмотра процессов в другом формате</w:t>
+      </w:r>
+    </w:p>
+    <w:p>
+      <w:pPr>
+        <w:pStyle w:val="CaptionedFigure"/>
+        <w:numPr>
+          <w:ilvl w:val="0"/>
+          <w:numId w:val="1000"/>
+        </w:numPr>
+      </w:pPr>
+      <w:r>
+        <w:drawing>
+          <wp:inline>
+            <wp:extent cx="5334000" cy="4560830"/>
+            <wp:effectExtent b="0" l="0" r="0" t="0"/>
+            <wp:docPr descr="Вывод команды ps -ef с полной информацией" title="" id="26" name="Picture"/>
+            <a:graphic>
+              <a:graphicData uri="http://schemas.openxmlformats.org/drawingml/2006/picture">
+                <pic:pic>
+                  <pic:nvPicPr>
+                    <pic:cNvPr descr="image/2.png" id="27" name="Picture"/>
+                    <pic:cNvPicPr>
+                      <a:picLocks noChangeArrowheads="1" noChangeAspect="1"/>
+                    </pic:cNvPicPr>
+                  </pic:nvPicPr>
+                  <pic:blipFill>
+                    <a:blip r:embed="rId25"/>
+                    <a:stretch>
+                      <a:fillRect/>
+                    </a:stretch>
+                  </pic:blipFill>
+                  <pic:spPr bwMode="auto">
+                    <a:xfrm>
+                      <a:off x="0" y="0"/>
+                      <a:ext cx="5334000" cy="4560830"/>
+                    </a:xfrm>
+                    <a:prstGeom prst="rect">
+                      <a:avLst/>
+                    </a:prstGeom>
+                    <a:noFill/>
+                    <a:ln w="9525">
+                      <a:noFill/>
+                      <a:headEnd/>
+                      <a:tailEnd/>
+                    </a:ln>
+                  </pic:spPr>
+                </pic:pic>
+              </a:graphicData>
+            </a:graphic>
+          </wp:inline>
+        </w:drawing>
+      </w:r>
+    </w:p>
+    <w:p>
+      <w:pPr>
+        <w:pStyle w:val="ImageCaption"/>
+        <w:numPr>
+          <w:ilvl w:val="0"/>
+          <w:numId w:val="1000"/>
+        </w:numPr>
+      </w:pPr>
+      <w:r>
+        <w:t xml:space="preserve">Вывод команды ps -ef с полной информацией</w:t>
+      </w:r>
+    </w:p>
+    <w:p>
+      <w:pPr>
+        <w:numPr>
+          <w:ilvl w:val="0"/>
+          <w:numId w:val="1002"/>
+        </w:numPr>
+      </w:pPr>
+      <w:r>
+        <w:t xml:space="preserve">Интерактивный мониторинг процессов с</w:t>
+      </w:r>
+      <w:r>
+        <w:t xml:space="preserve"> </w:t>
+      </w:r>
+      <w:r>
+        <w:rPr>
+          <w:rStyle w:val="VerbatimChar"/>
+        </w:rPr>
+        <w:t xml:space="preserve">top</w:t>
+      </w:r>
+    </w:p>
+    <w:p>
+      <w:pPr>
+        <w:pStyle w:val="CaptionedFigure"/>
+        <w:numPr>
+          <w:ilvl w:val="0"/>
+          <w:numId w:val="1000"/>
+        </w:numPr>
+      </w:pPr>
+      <w:r>
+        <w:drawing>
+          <wp:inline>
+            <wp:extent cx="5334000" cy="1729644"/>
+            <wp:effectExtent b="0" l="0" r="0" t="0"/>
+            <wp:docPr descr="Интерактивный монитор процессов top" title="" id="29" name="Picture"/>
+            <a:graphic>
+              <a:graphicData uri="http://schemas.openxmlformats.org/drawingml/2006/picture">
+                <pic:pic>
+                  <pic:nvPicPr>
+                    <pic:cNvPr descr="image/3.png" id="30" name="Picture"/>
+                    <pic:cNvPicPr>
+                      <a:picLocks noChangeArrowheads="1" noChangeAspect="1"/>
+                    </pic:cNvPicPr>
+                  </pic:nvPicPr>
+                  <pic:blipFill>
+                    <a:blip r:embed="rId28"/>
+                    <a:stretch>
+                      <a:fillRect/>
+                    </a:stretch>
+                  </pic:blipFill>
+                  <pic:spPr bwMode="auto">
+                    <a:xfrm>
+                      <a:off x="0" y="0"/>
+                      <a:ext cx="5334000" cy="1729644"/>
+                    </a:xfrm>
+                    <a:prstGeom prst="rect">
+                      <a:avLst/>
+                    </a:prstGeom>
+                    <a:noFill/>
+                    <a:ln w="9525">
+                      <a:noFill/>
+                      <a:headEnd/>
+                      <a:tailEnd/>
+                    </a:ln>
+                  </pic:spPr>
+                </pic:pic>
+              </a:graphicData>
+            </a:graphic>
+          </wp:inline>
+        </w:drawing>
+      </w:r>
+    </w:p>
+    <w:p>
+      <w:pPr>
+        <w:pStyle w:val="ImageCaption"/>
+        <w:numPr>
+          <w:ilvl w:val="0"/>
+          <w:numId w:val="1000"/>
+        </w:numPr>
+      </w:pPr>
+      <w:r>
+        <w:t xml:space="preserve">Интерактивный монитор процессов top</w:t>
+      </w:r>
+    </w:p>
+    <w:p>
+      <w:pPr>
+        <w:numPr>
+          <w:ilvl w:val="0"/>
+          <w:numId w:val="1002"/>
+        </w:numPr>
+      </w:pPr>
+      <w:r>
+        <w:t xml:space="preserve">Просмотр дерева процессов с</w:t>
+      </w:r>
+      <w:r>
+        <w:t xml:space="preserve"> </w:t>
+      </w:r>
+      <w:r>
+        <w:rPr>
+          <w:rStyle w:val="VerbatimChar"/>
+        </w:rPr>
+        <w:t xml:space="preserve">pstree</w:t>
+      </w:r>
+    </w:p>
+    <w:p>
+      <w:pPr>
+        <w:pStyle w:val="CaptionedFigure"/>
+        <w:numPr>
+          <w:ilvl w:val="0"/>
+          <w:numId w:val="1000"/>
+        </w:numPr>
+      </w:pPr>
+      <w:r>
+        <w:drawing>
+          <wp:inline>
+            <wp:extent cx="5334000" cy="2533896"/>
+            <wp:effectExtent b="0" l="0" r="0" t="0"/>
+            <wp:docPr descr="Древовидная структура процессов pstree" title="" id="32" name="Picture"/>
+            <a:graphic>
+              <a:graphicData uri="http://schemas.openxmlformats.org/drawingml/2006/picture">
+                <pic:pic>
+                  <pic:nvPicPr>
+                    <pic:cNvPr descr="image/4.png" id="33" name="Picture"/>
+                    <pic:cNvPicPr>
+                      <a:picLocks noChangeArrowheads="1" noChangeAspect="1"/>
+                    </pic:cNvPicPr>
+                  </pic:nvPicPr>
+                  <pic:blipFill>
+                    <a:blip r:embed="rId31"/>
+                    <a:stretch>
+                      <a:fillRect/>
+                    </a:stretch>
+                  </pic:blipFill>
+                  <pic:spPr bwMode="auto">
+                    <a:xfrm>
+                      <a:off x="0" y="0"/>
+                      <a:ext cx="5334000" cy="2533896"/>
+                    </a:xfrm>
+                    <a:prstGeom prst="rect">
+                      <a:avLst/>
+                    </a:prstGeom>
+                    <a:noFill/>
+                    <a:ln w="9525">
+                      <a:noFill/>
+                      <a:headEnd/>
+                      <a:tailEnd/>
+                    </a:ln>
+                  </pic:spPr>
+                </pic:pic>
+              </a:graphicData>
+            </a:graphic>
+          </wp:inline>
+        </w:drawing>
+      </w:r>
+    </w:p>
+    <w:p>
+      <w:pPr>
+        <w:pStyle w:val="ImageCaption"/>
+        <w:numPr>
+          <w:ilvl w:val="0"/>
+          <w:numId w:val="1000"/>
+        </w:numPr>
+      </w:pPr>
+      <w:r>
+        <w:t xml:space="preserve">Древовидная структура процессов pstree</w:t>
+      </w:r>
+    </w:p>
+    <w:p>
+      <w:pPr>
+        <w:numPr>
+          <w:ilvl w:val="0"/>
+          <w:numId w:val="1002"/>
+        </w:numPr>
+      </w:pPr>
+      <w:r>
+        <w:t xml:space="preserve">Поиск конкретного процесса по имени с</w:t>
+      </w:r>
+      <w:r>
+        <w:t xml:space="preserve"> </w:t>
+      </w:r>
+      <w:r>
+        <w:rPr>
+          <w:rStyle w:val="VerbatimChar"/>
+        </w:rPr>
+        <w:t xml:space="preserve">pgrep</w:t>
+      </w:r>
+    </w:p>
+    <w:p>
+      <w:pPr>
+        <w:pStyle w:val="CaptionedFigure"/>
+        <w:numPr>
+          <w:ilvl w:val="0"/>
+          <w:numId w:val="1000"/>
+        </w:numPr>
+      </w:pPr>
+      <w:r>
+        <w:drawing>
+          <wp:inline>
+            <wp:extent cx="5334000" cy="745612"/>
+            <wp:effectExtent b="0" l="0" r="0" t="0"/>
+            <wp:docPr descr="Поиск PID процесса с помощью pgrep" title="" id="35" name="Picture"/>
+            <a:graphic>
+              <a:graphicData uri="http://schemas.openxmlformats.org/drawingml/2006/picture">
+                <pic:pic>
+                  <pic:nvPicPr>
+                    <pic:cNvPr descr="image/5.png" id="36" name="Picture"/>
+                    <pic:cNvPicPr>
+                      <a:picLocks noChangeArrowheads="1" noChangeAspect="1"/>
+                    </pic:cNvPicPr>
+                  </pic:nvPicPr>
+                  <pic:blipFill>
+                    <a:blip r:embed="rId34"/>
+                    <a:stretch>
+                      <a:fillRect/>
+                    </a:stretch>
+                  </pic:blipFill>
+                  <pic:spPr bwMode="auto">
+                    <a:xfrm>
+                      <a:off x="0" y="0"/>
+                      <a:ext cx="5334000" cy="745612"/>
+                    </a:xfrm>
+                    <a:prstGeom prst="rect">
+                      <a:avLst/>
+                    </a:prstGeom>
+                    <a:noFill/>
+                    <a:ln w="9525">
+                      <a:noFill/>
+                      <a:headEnd/>
+                      <a:tailEnd/>
+                    </a:ln>
+                  </pic:spPr>
+                </pic:pic>
+              </a:graphicData>
+            </a:graphic>
+          </wp:inline>
+        </w:drawing>
+      </w:r>
+    </w:p>
+    <w:p>
+      <w:pPr>
+        <w:pStyle w:val="ImageCaption"/>
+        <w:numPr>
+          <w:ilvl w:val="0"/>
+          <w:numId w:val="1000"/>
+        </w:numPr>
+      </w:pPr>
+      <w:r>
+        <w:t xml:space="preserve">Поиск PID процесса с помощью pgrep</w:t>
+      </w:r>
+    </w:p>
+    <w:p>
+      <w:pPr>
+        <w:numPr>
+          <w:ilvl w:val="0"/>
+          <w:numId w:val="1002"/>
+        </w:numPr>
+      </w:pPr>
+      <w:r>
+        <w:t xml:space="preserve">Просмотр открытых файлов процесса с</w:t>
+      </w:r>
+      <w:r>
+        <w:t xml:space="preserve"> </w:t>
+      </w:r>
+      <w:r>
+        <w:rPr>
+          <w:rStyle w:val="VerbatimChar"/>
+        </w:rPr>
+        <w:t xml:space="preserve">lsof</w:t>
+      </w:r>
+    </w:p>
+    <w:p>
+      <w:pPr>
+        <w:pStyle w:val="CaptionedFigure"/>
+        <w:numPr>
+          <w:ilvl w:val="0"/>
+          <w:numId w:val="1000"/>
+        </w:numPr>
+      </w:pPr>
+      <w:r>
+        <w:drawing>
+          <wp:inline>
+            <wp:extent cx="5334000" cy="4131235"/>
+            <wp:effectExtent b="0" l="0" r="0" t="0"/>
+            <wp:docPr descr="Список открытых файлов процесса lsof" title="" id="38" name="Picture"/>
+            <a:graphic>
+              <a:graphicData uri="http://schemas.openxmlformats.org/drawingml/2006/picture">
+                <pic:pic>
+                  <pic:nvPicPr>
+                    <pic:cNvPr descr="image/6.png" id="39" name="Picture"/>
+                    <pic:cNvPicPr>
+                      <a:picLocks noChangeArrowheads="1" noChangeAspect="1"/>
+                    </pic:cNvPicPr>
+                  </pic:nvPicPr>
+                  <pic:blipFill>
+                    <a:blip r:embed="rId37"/>
+                    <a:stretch>
+                      <a:fillRect/>
+                    </a:stretch>
+                  </pic:blipFill>
+                  <pic:spPr bwMode="auto">
+                    <a:xfrm>
+                      <a:off x="0" y="0"/>
+                      <a:ext cx="5334000" cy="4131235"/>
+                    </a:xfrm>
+                    <a:prstGeom prst="rect">
+                      <a:avLst/>
+                    </a:prstGeom>
+                    <a:noFill/>
+                    <a:ln w="9525">
+                      <a:noFill/>
+                      <a:headEnd/>
+                      <a:tailEnd/>
+                    </a:ln>
+                  </pic:spPr>
+                </pic:pic>
+              </a:graphicData>
+            </a:graphic>
+          </wp:inline>
+        </w:drawing>
+      </w:r>
+    </w:p>
+    <w:p>
+      <w:pPr>
+        <w:pStyle w:val="ImageCaption"/>
+        <w:numPr>
+          <w:ilvl w:val="0"/>
+          <w:numId w:val="1000"/>
+        </w:numPr>
+      </w:pPr>
+      <w:r>
+        <w:t xml:space="preserve">Список открытых файлов процесса lsof</w:t>
+      </w:r>
+    </w:p>
+    <w:bookmarkEnd w:id="40"/>
+    <w:bookmarkStart w:id="44" w:name="часть-2-создание-и-управление-процессами"/>
+    <w:p>
+      <w:pPr>
+        <w:pStyle w:val="Heading2"/>
+      </w:pPr>
+      <w:r>
+        <w:t xml:space="preserve">Часть 2: Создание и управление процессами</w:t>
+      </w:r>
+    </w:p>
+    <w:p>
+      <w:pPr>
         <w:numPr>
           <w:ilvl w:val="0"/>
           <w:numId w:val="1003"/>
         </w:numPr>
       </w:pPr>
       <w:r>
-        <w:t xml:space="preserve">Enforcing: режим по умолчанию. При выборе этого режима все действия, которые каким-то образом нарушают текущую политику безопасности, будут блокироваться, а попытка нарушения будет зафиксирована в журнале.</w:t>
-      </w:r>
-    </w:p>
-    <w:p>
-      <w:pPr>
-        <w:pStyle w:val="Compact"/>
+        <w:t xml:space="preserve">Создание процесса в фоне с помощью</w:t>
+      </w:r>
+      <w:r>
+        <w:t xml:space="preserve"> </w:t>
+      </w:r>
+      <w:r>
+        <w:rPr>
+          <w:rStyle w:val="VerbatimChar"/>
+        </w:rPr>
+        <w:t xml:space="preserve">&amp;</w:t>
+      </w:r>
+    </w:p>
+    <w:p>
+      <w:pPr>
+        <w:pStyle w:val="CaptionedFigure"/>
+        <w:numPr>
+          <w:ilvl w:val="0"/>
+          <w:numId w:val="1000"/>
+        </w:numPr>
+      </w:pPr>
+      <w:r>
+        <w:drawing>
+          <wp:inline>
+            <wp:extent cx="5118100" cy="1219200"/>
+            <wp:effectExtent b="0" l="0" r="0" t="0"/>
+            <wp:docPr descr="Запуск процесса в фоне с символом &amp;" title="" id="42" name="Picture"/>
+            <a:graphic>
+              <a:graphicData uri="http://schemas.openxmlformats.org/drawingml/2006/picture">
+                <pic:pic>
+                  <pic:nvPicPr>
+                    <pic:cNvPr descr="image/7.png" id="43" name="Picture"/>
+                    <pic:cNvPicPr>
+                      <a:picLocks noChangeArrowheads="1" noChangeAspect="1"/>
+                    </pic:cNvPicPr>
+                  </pic:nvPicPr>
+                  <pic:blipFill>
+                    <a:blip r:embed="rId41"/>
+                    <a:stretch>
+                      <a:fillRect/>
+                    </a:stretch>
+                  </pic:blipFill>
+                  <pic:spPr bwMode="auto">
+                    <a:xfrm>
+                      <a:off x="0" y="0"/>
+                      <a:ext cx="5118100" cy="1219200"/>
+                    </a:xfrm>
+                    <a:prstGeom prst="rect">
+                      <a:avLst/>
+                    </a:prstGeom>
+                    <a:noFill/>
+                    <a:ln w="9525">
+                      <a:noFill/>
+                      <a:headEnd/>
+                      <a:tailEnd/>
+                    </a:ln>
+                  </pic:spPr>
+                </pic:pic>
+              </a:graphicData>
+            </a:graphic>
+          </wp:inline>
+        </w:drawing>
+      </w:r>
+    </w:p>
+    <w:p>
+      <w:pPr>
+        <w:pStyle w:val="ImageCaption"/>
+        <w:numPr>
+          <w:ilvl w:val="0"/>
+          <w:numId w:val="1000"/>
+        </w:numPr>
+      </w:pPr>
+      <w:r>
+        <w:t xml:space="preserve">Запуск процесса в фоне с символом &amp;</w:t>
+      </w:r>
+    </w:p>
+    <w:p>
+      <w:pPr>
         <w:numPr>
           <w:ilvl w:val="0"/>
           <w:numId w:val="1003"/>
         </w:numPr>
       </w:pPr>
       <w:r>
-        <w:t xml:space="preserve">Permissive: информация о всех действиях, которые нарушают текущую политику безопасности, будут зафиксированы в журнале, но сами действия не будут заблокированы.</w:t>
-      </w:r>
-    </w:p>
-    <w:p>
-      <w:pPr>
-        <w:pStyle w:val="Compact"/>
-        <w:numPr>
-          <w:ilvl w:val="0"/>
-          <w:numId w:val="1003"/>
-        </w:numPr>
-      </w:pPr>
-      <w:r>
-        <w:t xml:space="preserve">Disabled: полное отключение системы принудительного контроля доступа.</w:t>
-      </w:r>
-    </w:p>
-    <w:p>
-      <w:pPr>
-        <w:pStyle w:val="Compact"/>
-        <w:numPr>
-          <w:ilvl w:val="0"/>
-          <w:numId w:val="1004"/>
-        </w:numPr>
-      </w:pPr>
+        <w:t xml:space="preserve">Использование команды</w:t>
+      </w:r>
+      <w:r>
+        <w:t xml:space="preserve"> </w:t>
+      </w:r>
       <w:r>
         <w:rPr>
-          <w:b/>
-          <w:bCs/>
+          <w:rStyle w:val="VerbatimChar"/>
         </w:rPr>
-        <w:t xml:space="preserve">Apache</w:t>
-      </w:r>
-      <w:r>
-        <w:t xml:space="preserve"> </w:t>
-      </w:r>
-      <w:r>
-        <w:t xml:space="preserve">— это свободное программное обеспечение, с помощью которого можно создать веб-сервер.</w:t>
-      </w:r>
-    </w:p>
-    <w:bookmarkEnd w:id="21"/>
-    <w:bookmarkStart w:id="22" w:name="выполнение-лабораторной-работы"/>
-    <w:p>
-      <w:pPr>
-        <w:pStyle w:val="Heading1"/>
-      </w:pPr>
-      <w:r>
-        <w:t xml:space="preserve">Выполнение лабораторной работы</w:t>
-      </w:r>
-    </w:p>
-    <w:p>
-      <w:pPr>
-        <w:pStyle w:val="FirstParagraph"/>
-      </w:pPr>
-      <w:r>
-        <w:t xml:space="preserve">Войдём в систему и убедимся, что SELinux работает в режиме enforcing политики targeted с помощью команд getenforce и sestatus</w:t>
-      </w:r>
-    </w:p>
-    <w:tbl>
-      <w:tblPr>
-        <w:tblStyle w:val="FigureTable"/>
-        <w:tblW w:type="auto" w:w="0"/>
-        <w:jc w:val="center"/>
-        <w:tblLook w:firstRow="0" w:lastRow="0" w:firstColumn="0" w:lastColumn="0"/>
-      </w:tblPr>
-      <w:tblGrid>
-        <w:gridCol w:w="7920"/>
-      </w:tblGrid>
-      <w:tr>
-        <w:tc>
-          <w:tcPr/>
-          <w:p>
-            <w:pPr>
-              <w:pStyle w:val="Compact"/>
-              <w:jc w:val="center"/>
-            </w:pPr>
-            <w:r>
-              <w:t xml:space="preserve">Проверка работы в режиме enforcing политики targeted</w:t>
-            </w:r>
-          </w:p>
-        </w:tc>
-      </w:tr>
-    </w:tbl>
-    <w:p>
-      <w:pPr>
-        <w:pStyle w:val="ImageCaption"/>
-      </w:pPr>
-      <w:r>
-        <w:t xml:space="preserve">Проверка работы в режиме enforcing политики targeted</w:t>
-      </w:r>
-    </w:p>
-    <w:p>
-      <w:pPr>
-        <w:pStyle w:val="BodyText"/>
-      </w:pPr>
-      <w:r>
-        <w:t xml:space="preserve">Обратимся с помощью браузера к веб-серверу, запущенному на нашем компьютере, и убедимся, что последний работает</w:t>
-      </w:r>
-    </w:p>
-    <w:tbl>
-      <w:tblPr>
-        <w:tblStyle w:val="FigureTable"/>
-        <w:tblW w:type="auto" w:w="0"/>
-        <w:jc w:val="center"/>
-        <w:tblLook w:firstRow="0" w:lastRow="0" w:firstColumn="0" w:lastColumn="0"/>
-      </w:tblPr>
-      <w:tblGrid>
-        <w:gridCol w:w="7920"/>
-      </w:tblGrid>
-      <w:tr>
-        <w:tc>
-          <w:tcPr/>
-          <w:p>
-            <w:pPr>
-              <w:pStyle w:val="Compact"/>
-              <w:jc w:val="center"/>
-            </w:pPr>
-            <w:r>
-              <w:t xml:space="preserve">Проверка работы веб-сервера</w:t>
-            </w:r>
-          </w:p>
-        </w:tc>
-      </w:tr>
-    </w:tbl>
-    <w:p>
-      <w:pPr>
-        <w:pStyle w:val="ImageCaption"/>
-      </w:pPr>
-      <w:r>
-        <w:t xml:space="preserve">Проверка работы веб-сервера</w:t>
-      </w:r>
-    </w:p>
-    <w:p>
-      <w:pPr>
-        <w:pStyle w:val="BodyText"/>
-      </w:pPr>
-      <w:r>
-        <w:t xml:space="preserve">Затем найдём веб-сервер Apache в списке процессов и определим его контекст безопасности</w:t>
-      </w:r>
-    </w:p>
-    <w:tbl>
-      <w:tblPr>
-        <w:tblStyle w:val="FigureTable"/>
-        <w:tblW w:type="auto" w:w="0"/>
-        <w:jc w:val="center"/>
-        <w:tblLook w:firstRow="0" w:lastRow="0" w:firstColumn="0" w:lastColumn="0"/>
-      </w:tblPr>
-      <w:tblGrid>
-        <w:gridCol w:w="7920"/>
-      </w:tblGrid>
-      <w:tr>
-        <w:tc>
-          <w:tcPr/>
-          <w:p>
-            <w:pPr>
-              <w:pStyle w:val="Compact"/>
-              <w:jc w:val="center"/>
-            </w:pPr>
-            <w:r>
-              <w:t xml:space="preserve">Нахождение веб-сервера Apache в списке процессов и определение его контекста безопасности</w:t>
-            </w:r>
-          </w:p>
-        </w:tc>
-      </w:tr>
-    </w:tbl>
-    <w:p>
-      <w:pPr>
-        <w:pStyle w:val="ImageCaption"/>
-      </w:pPr>
-      <w:r>
-        <w:t xml:space="preserve">Нахождение веб-сервера Apache в списке процессов и определение его контекста безопасности</w:t>
-      </w:r>
-    </w:p>
-    <w:p>
-      <w:pPr>
-        <w:pStyle w:val="BodyText"/>
-      </w:pPr>
-      <w:r>
-        <w:t xml:space="preserve">Посмотрим текущее состояние переключателей SELinux для Apache</w:t>
-      </w:r>
-    </w:p>
-    <w:tbl>
-      <w:tblPr>
-        <w:tblStyle w:val="FigureTable"/>
-        <w:tblW w:type="auto" w:w="0"/>
-        <w:jc w:val="center"/>
-        <w:tblLook w:firstRow="0" w:lastRow="0" w:firstColumn="0" w:lastColumn="0"/>
-      </w:tblPr>
-      <w:tblGrid>
-        <w:gridCol w:w="7920"/>
-      </w:tblGrid>
-      <w:tr>
-        <w:tc>
-          <w:tcPr/>
-          <w:p>
-            <w:pPr>
-              <w:pStyle w:val="Compact"/>
-              <w:jc w:val="center"/>
-            </w:pPr>
-            <w:r>
-              <w:t xml:space="preserve">Просмотр текущего состояния переключателей SELinux</w:t>
-            </w:r>
-          </w:p>
-        </w:tc>
-      </w:tr>
-    </w:tbl>
-    <w:p>
-      <w:pPr>
-        <w:pStyle w:val="ImageCaption"/>
-      </w:pPr>
-      <w:r>
-        <w:t xml:space="preserve">Просмотр текущего состояния переключателей SELinux</w:t>
-      </w:r>
-    </w:p>
-    <w:p>
-      <w:pPr>
-        <w:pStyle w:val="BodyText"/>
-      </w:pPr>
-      <w:r>
-        <w:t xml:space="preserve">Далее посмотрим статистику по политике</w:t>
-      </w:r>
-    </w:p>
-    <w:tbl>
-      <w:tblPr>
-        <w:tblStyle w:val="FigureTable"/>
-        <w:tblW w:type="auto" w:w="0"/>
-        <w:jc w:val="center"/>
-        <w:tblLook w:firstRow="0" w:lastRow="0" w:firstColumn="0" w:lastColumn="0"/>
-      </w:tblPr>
-      <w:tblGrid>
-        <w:gridCol w:w="7920"/>
-      </w:tblGrid>
-      <w:tr>
-        <w:tc>
-          <w:tcPr/>
-          <w:p>
-            <w:pPr>
-              <w:pStyle w:val="Compact"/>
-              <w:jc w:val="center"/>
-            </w:pPr>
-            <w:r>
-              <w:t xml:space="preserve">Просмотр статистики по политике</w:t>
-            </w:r>
-          </w:p>
-        </w:tc>
-      </w:tr>
-    </w:tbl>
-    <w:p>
-      <w:pPr>
-        <w:pStyle w:val="ImageCaption"/>
-      </w:pPr>
-      <w:r>
-        <w:t xml:space="preserve">Просмотр статистики по политике</w:t>
-      </w:r>
-    </w:p>
-    <w:p>
-      <w:pPr>
-        <w:pStyle w:val="BodyText"/>
-      </w:pPr>
-      <w:r>
-        <w:t xml:space="preserve">Определим тип файлов и поддиректорий, находящихся в директории /var/www</w:t>
-      </w:r>
-    </w:p>
-    <w:tbl>
-      <w:tblPr>
-        <w:tblStyle w:val="FigureTable"/>
-        <w:tblW w:type="auto" w:w="0"/>
-        <w:jc w:val="center"/>
-        <w:tblLook w:firstRow="0" w:lastRow="0" w:firstColumn="0" w:lastColumn="0"/>
-      </w:tblPr>
-      <w:tblGrid>
-        <w:gridCol w:w="7920"/>
-      </w:tblGrid>
-      <w:tr>
-        <w:tc>
-          <w:tcPr/>
-          <w:p>
-            <w:pPr>
-              <w:pStyle w:val="Compact"/>
-              <w:jc w:val="center"/>
-            </w:pPr>
-            <w:r>
-              <w:t xml:space="preserve">Определение типов файлов и поддиректорий</w:t>
-            </w:r>
-          </w:p>
-        </w:tc>
-      </w:tr>
-    </w:tbl>
-    <w:p>
-      <w:pPr>
-        <w:pStyle w:val="ImageCaption"/>
-      </w:pPr>
-      <w:r>
-        <w:t xml:space="preserve">Определение типов файлов и поддиректорий</w:t>
-      </w:r>
-    </w:p>
-    <w:p>
-      <w:pPr>
-        <w:pStyle w:val="BodyText"/>
-      </w:pPr>
-      <w:r>
-        <w:t xml:space="preserve">Определим тип файлов, находящихся в директории /var/www/html</w:t>
-      </w:r>
-    </w:p>
-    <w:tbl>
-      <w:tblPr>
-        <w:tblStyle w:val="FigureTable"/>
-        <w:tblW w:type="auto" w:w="0"/>
-        <w:jc w:val="center"/>
-        <w:tblLook w:firstRow="0" w:lastRow="0" w:firstColumn="0" w:lastColumn="0"/>
-      </w:tblPr>
-      <w:tblGrid>
-        <w:gridCol w:w="7920"/>
-      </w:tblGrid>
-      <w:tr>
-        <w:tc>
-          <w:tcPr/>
-          <w:p>
-            <w:pPr>
-              <w:pStyle w:val="Compact"/>
-              <w:jc w:val="center"/>
-            </w:pPr>
-            <w:r>
-              <w:t xml:space="preserve">Определение типов файлов и поддиректорий</w:t>
-            </w:r>
-          </w:p>
-        </w:tc>
-      </w:tr>
-    </w:tbl>
-    <w:p>
-      <w:pPr>
-        <w:pStyle w:val="ImageCaption"/>
-      </w:pPr>
-      <w:r>
-        <w:t xml:space="preserve">Определение типов файлов и поддиректорий</w:t>
-      </w:r>
-    </w:p>
-    <w:p>
-      <w:pPr>
-        <w:pStyle w:val="BodyText"/>
-      </w:pPr>
-      <w:r>
-        <w:t xml:space="preserve">Следующим шагом создадим от имени суперпользователя html-файл /var/www/html/test.html с содержанием</w:t>
-      </w:r>
-      <w:r>
-        <w:t xml:space="preserve"> </w:t>
-      </w:r>
-      <w:r>
-        <w:t xml:space="preserve">“</w:t>
-      </w:r>
-      <w:r>
-        <w:t xml:space="preserve">test</w:t>
-      </w:r>
-      <w:r>
-        <w:t xml:space="preserve">”</w:t>
-      </w:r>
-    </w:p>
-    <w:tbl>
-      <w:tblPr>
-        <w:tblStyle w:val="FigureTable"/>
-        <w:tblW w:type="auto" w:w="0"/>
-        <w:jc w:val="center"/>
-        <w:tblLook w:firstRow="0" w:lastRow="0" w:firstColumn="0" w:lastColumn="0"/>
-      </w:tblPr>
-      <w:tblGrid>
-        <w:gridCol w:w="7920"/>
-      </w:tblGrid>
-      <w:tr>
-        <w:tc>
-          <w:tcPr/>
-          <w:p>
-            <w:pPr>
-              <w:pStyle w:val="Compact"/>
-              <w:jc w:val="center"/>
-            </w:pPr>
-            <w:r>
-              <w:t xml:space="preserve">Создание файла с содержанием</w:t>
-            </w:r>
-          </w:p>
-        </w:tc>
-      </w:tr>
-    </w:tbl>
-    <w:p>
-      <w:pPr>
-        <w:pStyle w:val="ImageCaption"/>
-      </w:pPr>
-      <w:r>
-        <w:t xml:space="preserve">Создание файла с содержанием</w:t>
-      </w:r>
-    </w:p>
-    <w:p>
-      <w:pPr>
-        <w:pStyle w:val="BodyText"/>
-      </w:pPr>
-      <w:r>
-        <w:t xml:space="preserve">Проверим контекст созданного нами файла</w:t>
-      </w:r>
-    </w:p>
-    <w:tbl>
-      <w:tblPr>
-        <w:tblStyle w:val="FigureTable"/>
-        <w:tblW w:type="auto" w:w="0"/>
-        <w:jc w:val="center"/>
-        <w:tblLook w:firstRow="0" w:lastRow="0" w:firstColumn="0" w:lastColumn="0"/>
-      </w:tblPr>
-      <w:tblGrid>
-        <w:gridCol w:w="7920"/>
-      </w:tblGrid>
-      <w:tr>
-        <w:tc>
-          <w:tcPr/>
-          <w:p>
-            <w:pPr>
-              <w:pStyle w:val="Compact"/>
-              <w:jc w:val="center"/>
-            </w:pPr>
-            <w:r>
-              <w:t xml:space="preserve">Проверка контекста созданного файла</w:t>
-            </w:r>
-          </w:p>
-        </w:tc>
-      </w:tr>
-    </w:tbl>
-    <w:p>
-      <w:pPr>
-        <w:pStyle w:val="ImageCaption"/>
-      </w:pPr>
-      <w:r>
-        <w:t xml:space="preserve">Проверка контекста созданного файла</w:t>
-      </w:r>
-    </w:p>
-    <w:p>
-      <w:pPr>
-        <w:pStyle w:val="BodyText"/>
-      </w:pPr>
-      <w:r>
-        <w:t xml:space="preserve">Изучим справку man httpd_selinux и выясним, какие контексты файлов определены для httpd. Сопоставим их с типом файла</w:t>
-      </w:r>
-      <w:r>
-        <w:t xml:space="preserve"> </w:t>
-      </w:r>
-      <w:r>
-        <w:t xml:space="preserve">test.html и проверим контекст файла</w:t>
-      </w:r>
-    </w:p>
-    <w:tbl>
-      <w:tblPr>
-        <w:tblStyle w:val="FigureTable"/>
-        <w:tblW w:type="auto" w:w="0"/>
-        <w:jc w:val="center"/>
-        <w:tblLook w:firstRow="0" w:lastRow="0" w:firstColumn="0" w:lastColumn="0"/>
-      </w:tblPr>
-      <w:tblGrid>
-        <w:gridCol w:w="7920"/>
-      </w:tblGrid>
-      <w:tr>
-        <w:tc>
-          <w:tcPr/>
-          <w:p>
-            <w:pPr>
-              <w:pStyle w:val="Compact"/>
-              <w:jc w:val="center"/>
-            </w:pPr>
-            <w:r>
-              <w:t xml:space="preserve">Изучение справки и проверка контекста файла</w:t>
-            </w:r>
-          </w:p>
-        </w:tc>
-      </w:tr>
-    </w:tbl>
-    <w:p>
-      <w:pPr>
-        <w:pStyle w:val="ImageCaption"/>
-      </w:pPr>
-      <w:r>
-        <w:t xml:space="preserve">Изучение справки и проверка контекста файла</w:t>
-      </w:r>
-    </w:p>
-    <w:p>
-      <w:pPr>
-        <w:pStyle w:val="BodyText"/>
-      </w:pPr>
-      <w:r>
-        <w:t xml:space="preserve">Изменим контекст файла /var/www/html/test.html с httpd_sys_content_t на samba_share_t</w:t>
-      </w:r>
-    </w:p>
-    <w:tbl>
-      <w:tblPr>
-        <w:tblStyle w:val="FigureTable"/>
-        <w:tblW w:type="auto" w:w="0"/>
-        <w:jc w:val="center"/>
-        <w:tblLook w:firstRow="0" w:lastRow="0" w:firstColumn="0" w:lastColumn="0"/>
-      </w:tblPr>
-      <w:tblGrid>
-        <w:gridCol w:w="7920"/>
-      </w:tblGrid>
-      <w:tr>
-        <w:tc>
-          <w:tcPr/>
-          <w:p>
-            <w:pPr>
-              <w:pStyle w:val="Compact"/>
-              <w:jc w:val="center"/>
-            </w:pPr>
-            <w:r>
-              <w:t xml:space="preserve">Изменение контекста файла и проверка</w:t>
-            </w:r>
-          </w:p>
-        </w:tc>
-      </w:tr>
-    </w:tbl>
-    <w:p>
-      <w:pPr>
-        <w:pStyle w:val="ImageCaption"/>
-      </w:pPr>
-      <w:r>
-        <w:t xml:space="preserve">Изменение контекста файла и проверка</w:t>
-      </w:r>
-    </w:p>
-    <w:p>
-      <w:pPr>
-        <w:pStyle w:val="BodyText"/>
-      </w:pPr>
-      <w:r>
-        <w:t xml:space="preserve">Попробуем получить доступ к файлу через веб-сервер, введя в браузере адрес http://127.0.0.1/test.html</w:t>
-      </w:r>
-    </w:p>
-    <w:tbl>
-      <w:tblPr>
-        <w:tblStyle w:val="FigureTable"/>
-        <w:tblW w:type="auto" w:w="0"/>
-        <w:jc w:val="center"/>
-        <w:tblLook w:firstRow="0" w:lastRow="0" w:firstColumn="0" w:lastColumn="0"/>
-      </w:tblPr>
-      <w:tblGrid>
-        <w:gridCol w:w="7920"/>
-      </w:tblGrid>
-      <w:tr>
-        <w:tc>
-          <w:tcPr/>
-          <w:p>
-            <w:pPr>
-              <w:pStyle w:val="Compact"/>
-              <w:jc w:val="center"/>
-            </w:pPr>
-            <w:r>
-              <w:t xml:space="preserve">Попытка получения доступа к файлу через веб-сервер</w:t>
-            </w:r>
-          </w:p>
-        </w:tc>
-      </w:tr>
-    </w:tbl>
-    <w:p>
-      <w:pPr>
-        <w:pStyle w:val="ImageCaption"/>
-      </w:pPr>
-      <w:r>
-        <w:t xml:space="preserve">Попытка получения доступа к файлу через веб-сервер</w:t>
-      </w:r>
-    </w:p>
-    <w:p>
-      <w:pPr>
-        <w:pStyle w:val="BodyText"/>
-      </w:pPr>
-      <w:r>
-        <w:t xml:space="preserve">Просмотрим log-файлы веб-сервера Apache и системный лог-файл</w:t>
-      </w:r>
-    </w:p>
-    <w:tbl>
-      <w:tblPr>
-        <w:tblStyle w:val="FigureTable"/>
-        <w:tblW w:type="auto" w:w="0"/>
-        <w:jc w:val="center"/>
-        <w:tblLook w:firstRow="0" w:lastRow="0" w:firstColumn="0" w:lastColumn="0"/>
-      </w:tblPr>
-      <w:tblGrid>
-        <w:gridCol w:w="7920"/>
-      </w:tblGrid>
-      <w:tr>
-        <w:tc>
-          <w:tcPr/>
-          <w:p>
-            <w:pPr>
-              <w:pStyle w:val="Compact"/>
-              <w:jc w:val="center"/>
-            </w:pPr>
-            <w:r>
-              <w:t xml:space="preserve">Просмотр log-файлов веб-сервера Apache и системного лог-файла</w:t>
-            </w:r>
-          </w:p>
-        </w:tc>
-      </w:tr>
-    </w:tbl>
-    <w:p>
-      <w:pPr>
-        <w:pStyle w:val="ImageCaption"/>
-      </w:pPr>
-      <w:r>
-        <w:t xml:space="preserve">Просмотр log-файлов веб-сервера Apache и системного лог-файла</w:t>
-      </w:r>
-    </w:p>
-    <w:p>
-      <w:pPr>
-        <w:pStyle w:val="BodyText"/>
-      </w:pPr>
-      <w:r>
-        <w:t xml:space="preserve">Попробуем запустить веб-сервер Apache на прослушивание ТСР-порта 81 (а не 80, как рекомендует IANA и прописано в /etc/services)</w:t>
-      </w:r>
-    </w:p>
-    <w:tbl>
-      <w:tblPr>
-        <w:tblStyle w:val="FigureTable"/>
-        <w:tblW w:type="auto" w:w="0"/>
-        <w:jc w:val="center"/>
-        <w:tblLook w:firstRow="0" w:lastRow="0" w:firstColumn="0" w:lastColumn="0"/>
-      </w:tblPr>
-      <w:tblGrid>
-        <w:gridCol w:w="7920"/>
-      </w:tblGrid>
-      <w:tr>
-        <w:tc>
-          <w:tcPr/>
-          <w:p>
-            <w:pPr>
-              <w:pStyle w:val="Compact"/>
-              <w:jc w:val="center"/>
-            </w:pPr>
-            <w:r>
-              <w:t xml:space="preserve">Попытка запуска веб-сервера Apache на прослушивание ТСР-порта 81</w:t>
-            </w:r>
-          </w:p>
-        </w:tc>
-      </w:tr>
-    </w:tbl>
-    <w:p>
-      <w:pPr>
-        <w:pStyle w:val="ImageCaption"/>
-      </w:pPr>
-      <w:r>
-        <w:t xml:space="preserve">Попытка запуска веб-сервера Apache на прослушивание ТСР-порта 81</w:t>
-      </w:r>
-    </w:p>
-    <w:p>
-      <w:pPr>
-        <w:pStyle w:val="BodyText"/>
-      </w:pPr>
-      <w:r>
-        <w:t xml:space="preserve">Выполним перезапуск веб-сервера Apache</w:t>
-      </w:r>
-    </w:p>
-    <w:bookmarkEnd w:id="22"/>
-    <w:bookmarkStart w:id="23" w:name="вывод"/>
-    <w:p>
-      <w:pPr>
-        <w:pStyle w:val="Heading1"/>
-      </w:pPr>
-      <w:r>
-        <w:t xml:space="preserve">Вывод</w:t>
-      </w:r>
-    </w:p>
-    <w:p>
-      <w:pPr>
-        <w:pStyle w:val="FirstParagraph"/>
-      </w:pPr>
-      <w:r>
-        <w:t xml:space="preserve">В ходе выполнения лабораторной работы были развиты навыки администрирования ОС Linux, получено первое практическое</w:t>
-      </w:r>
-      <w:r>
-        <w:t xml:space="preserve"> </w:t>
-      </w:r>
-      <w:r>
-        <w:t xml:space="preserve">знакомство с технологией SELinux и проверена работа SELinux на практике совместно с веб-сервером Apache.</w:t>
-      </w:r>
-    </w:p>
-    <w:bookmarkEnd w:id="23"/>
+        <w:t xml:space="preserve">dd</w:t>
+      </w:r>
+      <w:r>
+        <w:t xml:space="preserve"> </w:t>
+      </w:r>
+      <w:r>
+        <w:t xml:space="preserve">для создания нагрузки:</w:t>
+      </w:r>
+    </w:p>
+    <w:bookmarkEnd w:id="44"/>
+    <w:bookmarkEnd w:id="45"/>
     <w:sectPr/>
   </w:body>
 </w:document>
@@ -1197,11 +1338,11 @@
       </w:pPr>
     </w:lvl>
   </w:abstractNum>
-  <w:abstractNum w:abstractNumId="99412">
-    <w:nsid w:val="00A99412"/>
+  <w:abstractNum w:abstractNumId="99417">
+    <w:nsid w:val="00A99417"/>
     <w:multiLevelType w:val="multilevel"/>
     <w:lvl w:ilvl="0">
-      <w:start w:val="2"/>
+      <w:start w:val="7"/>
       <w:numFmt w:val="decimal"/>
       <w:lvlText w:val="%1."/>
       <w:lvlJc w:val="left"/>
@@ -1210,7 +1351,7 @@
       </w:pPr>
     </w:lvl>
     <w:lvl w:ilvl="1">
-      <w:start w:val="2"/>
+      <w:start w:val="7"/>
       <w:numFmt w:val="decimal"/>
       <w:lvlText w:val="%2."/>
       <w:lvlJc w:val="left"/>
@@ -1219,7 +1360,7 @@
       </w:pPr>
     </w:lvl>
     <w:lvl w:ilvl="2">
-      <w:start w:val="2"/>
+      <w:start w:val="7"/>
       <w:numFmt w:val="decimal"/>
       <w:lvlText w:val="%3."/>
       <w:lvlJc w:val="left"/>
@@ -1228,7 +1369,7 @@
       </w:pPr>
     </w:lvl>
     <w:lvl w:ilvl="3">
-      <w:start w:val="2"/>
+      <w:start w:val="7"/>
       <w:numFmt w:val="decimal"/>
       <w:lvlText w:val="%4."/>
       <w:lvlJc w:val="left"/>
@@ -1237,7 +1378,7 @@
       </w:pPr>
     </w:lvl>
     <w:lvl w:ilvl="4">
-      <w:start w:val="2"/>
+      <w:start w:val="7"/>
       <w:numFmt w:val="decimal"/>
       <w:lvlText w:val="%5."/>
       <w:lvlJc w:val="left"/>
@@ -1246,7 +1387,7 @@
       </w:pPr>
     </w:lvl>
     <w:lvl w:ilvl="5">
-      <w:start w:val="2"/>
+      <w:start w:val="7"/>
       <w:numFmt w:val="decimal"/>
       <w:lvlText w:val="%6."/>
       <w:lvlJc w:val="left"/>
@@ -1255,7 +1396,7 @@
       </w:pPr>
     </w:lvl>
     <w:lvl w:ilvl="6">
-      <w:start w:val="2"/>
+      <w:start w:val="7"/>
       <w:numFmt w:val="decimal"/>
       <w:lvlText w:val="%7."/>
       <w:lvlJc w:val="left"/>
@@ -1264,7 +1405,7 @@
       </w:pPr>
     </w:lvl>
     <w:lvl w:ilvl="7">
-      <w:start w:val="2"/>
+      <w:start w:val="7"/>
       <w:numFmt w:val="decimal"/>
       <w:lvlText w:val="%8."/>
       <w:lvlJc w:val="left"/>
@@ -1273,7 +1414,7 @@
       </w:pPr>
     </w:lvl>
     <w:lvl w:ilvl="8">
-      <w:start w:val="2"/>
+      <w:start w:val="7"/>
       <w:numFmt w:val="decimal"/>
       <w:lvlText w:val="%9."/>
       <w:lvlJc w:val="left"/>
@@ -1319,36 +1460,33 @@
     </w:lvlOverride>
   </w:num>
   <w:num w:numId="1003">
-    <w:abstractNumId w:val="991"/>
-  </w:num>
-  <w:num w:numId="1004">
-    <w:abstractNumId w:val="99412"/>
+    <w:abstractNumId w:val="99417"/>
     <w:lvlOverride w:ilvl="0">
-      <w:startOverride w:val="2"/>
+      <w:startOverride w:val="7"/>
     </w:lvlOverride>
     <w:lvlOverride w:ilvl="1">
-      <w:startOverride w:val="2"/>
+      <w:startOverride w:val="7"/>
     </w:lvlOverride>
     <w:lvlOverride w:ilvl="2">
-      <w:startOverride w:val="2"/>
+      <w:startOverride w:val="7"/>
     </w:lvlOverride>
     <w:lvlOverride w:ilvl="3">
-      <w:startOverride w:val="2"/>
+      <w:startOverride w:val="7"/>
     </w:lvlOverride>
     <w:lvlOverride w:ilvl="4">
-      <w:startOverride w:val="2"/>
+      <w:startOverride w:val="7"/>
     </w:lvlOverride>
     <w:lvlOverride w:ilvl="5">
-      <w:startOverride w:val="2"/>
+      <w:startOverride w:val="7"/>
     </w:lvlOverride>
     <w:lvlOverride w:ilvl="6">
-      <w:startOverride w:val="2"/>
+      <w:startOverride w:val="7"/>
     </w:lvlOverride>
     <w:lvlOverride w:ilvl="7">
-      <w:startOverride w:val="2"/>
+      <w:startOverride w:val="7"/>
     </w:lvlOverride>
     <w:lvlOverride w:ilvl="8">
-      <w:startOverride w:val="2"/>
+      <w:startOverride w:val="7"/>
     </w:lvlOverride>
   </w:num>
 </w:numbering>

</xml_diff>